<commit_message>
docs: regenerate Brainstorming & Idea Prioritization to match template screenshot exactly
</commit_message>
<xml_diff>
--- a/Project Documentation/1. Brainstorming & Ideation/Brainstorming & Idea Prioritization.docx
+++ b/Project Documentation/1. Brainstorming & Ideation/Brainstorming & Idea Prioritization.docx
@@ -7,7 +7,7 @@
         <w:pStyle w:val="Title"/>
       </w:pPr>
       <w:r>
-        <w:t>Brainstorming &amp; Idea Prioritization</w:t>
+        <w:t>Brainstorming &amp; Idea Prioritization Template</w:t>
       </w:r>
     </w:p>
     <w:tbl>
@@ -58,7 +58,7 @@
           </w:tcPr>
           <w:p>
             <w:r>
-              <w:t>15 March 2026</w:t>
+              <w:t>15 March 2024</w:t>
             </w:r>
           </w:p>
         </w:tc>
@@ -80,7 +80,7 @@
           </w:tcPr>
           <w:p>
             <w:r>
-              <w:t>PNT2022TMID124356</w:t>
+              <w:t>xxxxxx</w:t>
             </w:r>
           </w:p>
         </w:tc>
@@ -102,7 +102,7 @@
           </w:tcPr>
           <w:p>
             <w:r>
-              <w:t>SmartLender AI – Loan Eligibility Prediction</w:t>
+              <w:t>xxxxxx</w:t>
             </w:r>
           </w:p>
         </w:tc>
@@ -114,7 +114,7 @@
           </w:tcPr>
           <w:p>
             <w:r>
-              <w:t>Submission Stage</w:t>
+              <w:t>Maximum Marks</w:t>
             </w:r>
           </w:p>
         </w:tc>
@@ -124,7 +124,7 @@
           </w:tcPr>
           <w:p>
             <w:r>
-              <w:t>1. Brainstorming &amp; Ideation</w:t>
+              <w:t>3 Marks</w:t>
             </w:r>
           </w:p>
         </w:tc>
@@ -140,7 +140,12 @@
         <w:pStyle w:val="Heading1"/>
       </w:pPr>
       <w:r>
-        <w:t>Idea Listing</w:t>
+        <w:t>Step 1: Brainstorm and Idea Listing</w:t>
+      </w:r>
+    </w:p>
+    <w:p>
+      <w:r>
+        <w:t>Each team member lists out as many ideas as possible without judging them at this stage.</w:t>
       </w:r>
     </w:p>
     <w:tbl>
@@ -149,15 +154,16 @@
         <w:tblLook w:firstColumn="1" w:firstRow="1" w:lastColumn="0" w:lastRow="0" w:noHBand="0" w:noVBand="1" w:val="04A0"/>
       </w:tblPr>
       <w:tblGrid>
-        <w:gridCol w:w="2160"/>
-        <w:gridCol w:w="2160"/>
-        <w:gridCol w:w="2160"/>
-        <w:gridCol w:w="2160"/>
+        <w:gridCol w:w="1728"/>
+        <w:gridCol w:w="1728"/>
+        <w:gridCol w:w="1728"/>
+        <w:gridCol w:w="1728"/>
+        <w:gridCol w:w="1728"/>
       </w:tblGrid>
       <w:tr>
         <w:tc>
           <w:tcPr>
-            <w:tcW w:type="dxa" w:w="2160"/>
+            <w:tcW w:type="dxa" w:w="1728"/>
           </w:tcPr>
           <w:p>
             <w:r>
@@ -167,31 +173,41 @@
         </w:tc>
         <w:tc>
           <w:tcPr>
-            <w:tcW w:type="dxa" w:w="2160"/>
+            <w:tcW w:type="dxa" w:w="1728"/>
           </w:tcPr>
           <w:p>
             <w:r>
-              <w:t>Proposed Idea</w:t>
+              <w:t>Team Member</w:t>
             </w:r>
           </w:p>
         </w:tc>
         <w:tc>
           <w:tcPr>
-            <w:tcW w:type="dxa" w:w="2160"/>
+            <w:tcW w:type="dxa" w:w="1728"/>
           </w:tcPr>
           <w:p>
             <w:r>
-              <w:t>Description</w:t>
+              <w:t>Idea / Suggestion</w:t>
             </w:r>
           </w:p>
         </w:tc>
         <w:tc>
           <w:tcPr>
-            <w:tcW w:type="dxa" w:w="2160"/>
+            <w:tcW w:type="dxa" w:w="1728"/>
           </w:tcPr>
           <w:p>
             <w:r>
-              <w:t>Focus Area</w:t>
+              <w:t>Category</w:t>
+            </w:r>
+          </w:p>
+        </w:tc>
+        <w:tc>
+          <w:tcPr>
+            <w:tcW w:type="dxa" w:w="1728"/>
+          </w:tcPr>
+          <w:p>
+            <w:r>
+              <w:t>Group No.</w:t>
             </w:r>
           </w:p>
         </w:tc>
@@ -199,7 +215,7 @@
       <w:tr>
         <w:tc>
           <w:tcPr>
-            <w:tcW w:type="dxa" w:w="2160"/>
+            <w:tcW w:type="dxa" w:w="1728"/>
           </w:tcPr>
           <w:p>
             <w:r>
@@ -209,31 +225,41 @@
         </w:tc>
         <w:tc>
           <w:tcPr>
-            <w:tcW w:type="dxa" w:w="2160"/>
+            <w:tcW w:type="dxa" w:w="1728"/>
           </w:tcPr>
           <w:p>
             <w:r>
-              <w:t>Multi-Classifier ML Pipeline</w:t>
+              <w:t>Member 1</w:t>
             </w:r>
           </w:p>
         </w:tc>
         <w:tc>
           <w:tcPr>
-            <w:tcW w:type="dxa" w:w="2160"/>
+            <w:tcW w:type="dxa" w:w="1728"/>
           </w:tcPr>
           <w:p>
             <w:r>
-              <w:t>Train RF, Gradient Boosting, KNN, SVM, and LR.</w:t>
+              <w:t>Train ML classification model for automated prediction.</w:t>
             </w:r>
           </w:p>
         </w:tc>
         <w:tc>
           <w:tcPr>
-            <w:tcW w:type="dxa" w:w="2160"/>
+            <w:tcW w:type="dxa" w:w="1728"/>
           </w:tcPr>
           <w:p>
             <w:r>
-              <w:t>Model Performance</w:t>
+              <w:t>Machine Learning</w:t>
+            </w:r>
+          </w:p>
+        </w:tc>
+        <w:tc>
+          <w:tcPr>
+            <w:tcW w:type="dxa" w:w="1728"/>
+          </w:tcPr>
+          <w:p>
+            <w:r>
+              <w:t>1</w:t>
             </w:r>
           </w:p>
         </w:tc>
@@ -241,7 +267,7 @@
       <w:tr>
         <w:tc>
           <w:tcPr>
-            <w:tcW w:type="dxa" w:w="2160"/>
+            <w:tcW w:type="dxa" w:w="1728"/>
           </w:tcPr>
           <w:p>
             <w:r>
@@ -251,31 +277,41 @@
         </w:tc>
         <w:tc>
           <w:tcPr>
-            <w:tcW w:type="dxa" w:w="2160"/>
+            <w:tcW w:type="dxa" w:w="1728"/>
           </w:tcPr>
           <w:p>
             <w:r>
-              <w:t>Underwriting Guardrails Veto</w:t>
+              <w:t>Member 2</w:t>
             </w:r>
           </w:p>
         </w:tc>
         <w:tc>
           <w:tcPr>
-            <w:tcW w:type="dxa" w:w="2160"/>
+            <w:tcW w:type="dxa" w:w="1728"/>
           </w:tcPr>
           <w:p>
             <w:r>
-              <w:t>Apply credit history veto and DTI checks to predict route.</w:t>
+              <w:t>Build web-based form interface with Dark/Light mode theme.</w:t>
             </w:r>
           </w:p>
         </w:tc>
         <w:tc>
           <w:tcPr>
-            <w:tcW w:type="dxa" w:w="2160"/>
+            <w:tcW w:type="dxa" w:w="1728"/>
           </w:tcPr>
           <w:p>
             <w:r>
-              <w:t>Risk Management</w:t>
+              <w:t>Frontend</w:t>
+            </w:r>
+          </w:p>
+        </w:tc>
+        <w:tc>
+          <w:tcPr>
+            <w:tcW w:type="dxa" w:w="1728"/>
+          </w:tcPr>
+          <w:p>
+            <w:r>
+              <w:t>2</w:t>
             </w:r>
           </w:p>
         </w:tc>
@@ -283,7 +319,7 @@
       <w:tr>
         <w:tc>
           <w:tcPr>
-            <w:tcW w:type="dxa" w:w="2160"/>
+            <w:tcW w:type="dxa" w:w="1728"/>
           </w:tcPr>
           <w:p>
             <w:r>
@@ -293,31 +329,41 @@
         </w:tc>
         <w:tc>
           <w:tcPr>
-            <w:tcW w:type="dxa" w:w="2160"/>
+            <w:tcW w:type="dxa" w:w="1728"/>
           </w:tcPr>
           <w:p>
             <w:r>
-              <w:t>Dynamic Telemetry Feed</w:t>
+              <w:t>Member 3</w:t>
             </w:r>
           </w:p>
         </w:tc>
         <w:tc>
           <w:tcPr>
-            <w:tcW w:type="dxa" w:w="2160"/>
+            <w:tcW w:type="dxa" w:w="1728"/>
           </w:tcPr>
           <w:p>
             <w:r>
-              <w:t>Expose model metrics at endpoint /model-telemetry.</w:t>
+              <w:t>Create Flask REST API backend endpoints for application routing.</w:t>
             </w:r>
           </w:p>
         </w:tc>
         <w:tc>
           <w:tcPr>
-            <w:tcW w:type="dxa" w:w="2160"/>
+            <w:tcW w:type="dxa" w:w="1728"/>
           </w:tcPr>
           <w:p>
             <w:r>
-              <w:t>System Transparency</w:t>
+              <w:t>Backend</w:t>
+            </w:r>
+          </w:p>
+        </w:tc>
+        <w:tc>
+          <w:tcPr>
+            <w:tcW w:type="dxa" w:w="1728"/>
+          </w:tcPr>
+          <w:p>
+            <w:r>
+              <w:t>3</w:t>
             </w:r>
           </w:p>
         </w:tc>
@@ -325,7 +371,7 @@
       <w:tr>
         <w:tc>
           <w:tcPr>
-            <w:tcW w:type="dxa" w:w="2160"/>
+            <w:tcW w:type="dxa" w:w="1728"/>
           </w:tcPr>
           <w:p>
             <w:r>
@@ -335,42 +381,166 @@
         </w:tc>
         <w:tc>
           <w:tcPr>
-            <w:tcW w:type="dxa" w:w="2160"/>
+            <w:tcW w:type="dxa" w:w="1728"/>
           </w:tcPr>
           <w:p>
             <w:r>
-              <w:t>Stepped Loading Progress</w:t>
+              <w:t>Member 1</w:t>
             </w:r>
           </w:p>
         </w:tc>
         <w:tc>
           <w:tcPr>
-            <w:tcW w:type="dxa" w:w="2160"/>
+            <w:tcW w:type="dxa" w:w="1728"/>
           </w:tcPr>
           <w:p>
             <w:r>
-              <w:t>Show progress checklist stages to users during execution.</w:t>
+              <w:t>Implement Credit History veto risk-mitigation rule checks.</w:t>
             </w:r>
           </w:p>
         </w:tc>
         <w:tc>
           <w:tcPr>
-            <w:tcW w:type="dxa" w:w="2160"/>
+            <w:tcW w:type="dxa" w:w="1728"/>
           </w:tcPr>
           <w:p>
             <w:r>
-              <w:t>User Engagement</w:t>
+              <w:t>Backend</w:t>
+            </w:r>
+          </w:p>
+        </w:tc>
+        <w:tc>
+          <w:tcPr>
+            <w:tcW w:type="dxa" w:w="1728"/>
+          </w:tcPr>
+          <w:p>
+            <w:r>
+              <w:t>1</w:t>
+            </w:r>
+          </w:p>
+        </w:tc>
+      </w:tr>
+      <w:tr>
+        <w:tc>
+          <w:tcPr>
+            <w:tcW w:type="dxa" w:w="1728"/>
+          </w:tcPr>
+          <w:p>
+            <w:r>
+              <w:t>5</w:t>
+            </w:r>
+          </w:p>
+        </w:tc>
+        <w:tc>
+          <w:tcPr>
+            <w:tcW w:type="dxa" w:w="1728"/>
+          </w:tcPr>
+          <w:p>
+            <w:r>
+              <w:t>Member 2</w:t>
+            </w:r>
+          </w:p>
+        </w:tc>
+        <w:tc>
+          <w:tcPr>
+            <w:tcW w:type="dxa" w:w="1728"/>
+          </w:tcPr>
+          <w:p>
+            <w:r>
+              <w:t>Render dynamic insights cards with positive/negative validation explainers.</w:t>
+            </w:r>
+          </w:p>
+        </w:tc>
+        <w:tc>
+          <w:tcPr>
+            <w:tcW w:type="dxa" w:w="1728"/>
+          </w:tcPr>
+          <w:p>
+            <w:r>
+              <w:t>Frontend</w:t>
+            </w:r>
+          </w:p>
+        </w:tc>
+        <w:tc>
+          <w:tcPr>
+            <w:tcW w:type="dxa" w:w="1728"/>
+          </w:tcPr>
+          <w:p>
+            <w:r>
+              <w:t>2</w:t>
+            </w:r>
+          </w:p>
+        </w:tc>
+      </w:tr>
+      <w:tr>
+        <w:tc>
+          <w:tcPr>
+            <w:tcW w:type="dxa" w:w="1728"/>
+          </w:tcPr>
+          <w:p>
+            <w:r>
+              <w:t>6</w:t>
+            </w:r>
+          </w:p>
+        </w:tc>
+        <w:tc>
+          <w:tcPr>
+            <w:tcW w:type="dxa" w:w="1728"/>
+          </w:tcPr>
+          <w:p>
+            <w:r>
+              <w:t>Member 3</w:t>
+            </w:r>
+          </w:p>
+        </w:tc>
+        <w:tc>
+          <w:tcPr>
+            <w:tcW w:type="dxa" w:w="1728"/>
+          </w:tcPr>
+          <w:p>
+            <w:r>
+              <w:t>Expose accuracy and coefficient telemetry at /model-telemetry.</w:t>
+            </w:r>
+          </w:p>
+        </w:tc>
+        <w:tc>
+          <w:tcPr>
+            <w:tcW w:type="dxa" w:w="1728"/>
+          </w:tcPr>
+          <w:p>
+            <w:r>
+              <w:t>Backend</w:t>
+            </w:r>
+          </w:p>
+        </w:tc>
+        <w:tc>
+          <w:tcPr>
+            <w:tcW w:type="dxa" w:w="1728"/>
+          </w:tcPr>
+          <w:p>
+            <w:r>
+              <w:t>3</w:t>
             </w:r>
           </w:p>
         </w:tc>
       </w:tr>
     </w:tbl>
     <w:p>
+      <w:r>
+        <w:br/>
+      </w:r>
+    </w:p>
+    <w:p>
       <w:pPr>
         <w:pStyle w:val="Heading1"/>
       </w:pPr>
       <w:r>
-        <w:t>Idea Prioritization Matrix</w:t>
+        <w:t>Step 2: Idea Prioritization</w:t>
+      </w:r>
+    </w:p>
+    <w:p>
+      <w:r>
+        <w:t>Rate each grouped idea on feasibility and importance, then select the final idea(s) to move forward with.</w:t>
       </w:r>
     </w:p>
     <w:tbl>
@@ -393,7 +563,7 @@
           </w:tcPr>
           <w:p>
             <w:r>
-              <w:t>S.No</w:t>
+              <w:t>Group No</w:t>
             </w:r>
           </w:p>
         </w:tc>
@@ -403,7 +573,7 @@
           </w:tcPr>
           <w:p>
             <w:r>
-              <w:t>Idea Option</w:t>
+              <w:t>Final Idea</w:t>
             </w:r>
           </w:p>
         </w:tc>
@@ -413,7 +583,7 @@
           </w:tcPr>
           <w:p>
             <w:r>
-              <w:t>Feasibility (1-5)</w:t>
+              <w:t>Feasibility (High/Medium/Low)</w:t>
             </w:r>
           </w:p>
         </w:tc>
@@ -423,7 +593,7 @@
           </w:tcPr>
           <w:p>
             <w:r>
-              <w:t>Importance (1-5)</w:t>
+              <w:t>Importance (High/Medium/Low)</w:t>
             </w:r>
           </w:p>
         </w:tc>
@@ -433,7 +603,7 @@
           </w:tcPr>
           <w:p>
             <w:r>
-              <w:t>Priority Rank</w:t>
+              <w:t>Priority</w:t>
             </w:r>
           </w:p>
         </w:tc>
@@ -443,7 +613,7 @@
           </w:tcPr>
           <w:p>
             <w:r>
-              <w:t>Selected</w:t>
+              <w:t>Selected (Yes/No)</w:t>
             </w:r>
           </w:p>
         </w:tc>
@@ -465,7 +635,7 @@
           </w:tcPr>
           <w:p>
             <w:r>
-              <w:t>ML Model Training Comparison</w:t>
+              <w:t>Automated ML Pipeline with Credit History Veto Rules</w:t>
             </w:r>
           </w:p>
         </w:tc>
@@ -475,7 +645,7 @@
           </w:tcPr>
           <w:p>
             <w:r>
-              <w:t>5</w:t>
+              <w:t>High</w:t>
             </w:r>
           </w:p>
         </w:tc>
@@ -485,7 +655,7 @@
           </w:tcPr>
           <w:p>
             <w:r>
-              <w:t>5</w:t>
+              <w:t>High</w:t>
             </w:r>
           </w:p>
         </w:tc>
@@ -527,7 +697,7 @@
           </w:tcPr>
           <w:p>
             <w:r>
-              <w:t>Credit History Veto Interceptor</w:t>
+              <w:t>Web-based Responsive Interface with Theme Toggle</w:t>
             </w:r>
           </w:p>
         </w:tc>
@@ -537,7 +707,7 @@
           </w:tcPr>
           <w:p>
             <w:r>
-              <w:t>5</w:t>
+              <w:t>High</w:t>
             </w:r>
           </w:p>
         </w:tc>
@@ -547,7 +717,7 @@
           </w:tcPr>
           <w:p>
             <w:r>
-              <w:t>5</w:t>
+              <w:t>High</w:t>
             </w:r>
           </w:p>
         </w:tc>
@@ -557,7 +727,7 @@
           </w:tcPr>
           <w:p>
             <w:r>
-              <w:t>1</w:t>
+              <w:t>2</w:t>
             </w:r>
           </w:p>
         </w:tc>
@@ -589,7 +759,7 @@
           </w:tcPr>
           <w:p>
             <w:r>
-              <w:t>Responsive Form Sliders</w:t>
+              <w:t>Flask Web API Backend Routing Engine</w:t>
             </w:r>
           </w:p>
         </w:tc>
@@ -599,7 +769,7 @@
           </w:tcPr>
           <w:p>
             <w:r>
-              <w:t>5</w:t>
+              <w:t>High</w:t>
             </w:r>
           </w:p>
         </w:tc>
@@ -609,7 +779,7 @@
           </w:tcPr>
           <w:p>
             <w:r>
-              <w:t>4</w:t>
+              <w:t>High</w:t>
             </w:r>
           </w:p>
         </w:tc>
@@ -619,69 +789,7 @@
           </w:tcPr>
           <w:p>
             <w:r>
-              <w:t>2</w:t>
-            </w:r>
-          </w:p>
-        </w:tc>
-        <w:tc>
-          <w:tcPr>
-            <w:tcW w:type="dxa" w:w="1440"/>
-          </w:tcPr>
-          <w:p>
-            <w:r>
-              <w:t>Yes</w:t>
-            </w:r>
-          </w:p>
-        </w:tc>
-      </w:tr>
-      <w:tr>
-        <w:tc>
-          <w:tcPr>
-            <w:tcW w:type="dxa" w:w="1440"/>
-          </w:tcPr>
-          <w:p>
-            <w:r>
-              <w:t>4</w:t>
-            </w:r>
-          </w:p>
-        </w:tc>
-        <w:tc>
-          <w:tcPr>
-            <w:tcW w:type="dxa" w:w="1440"/>
-          </w:tcPr>
-          <w:p>
-            <w:r>
-              <w:t>Real-Time Telemetry Feed</w:t>
-            </w:r>
-          </w:p>
-        </w:tc>
-        <w:tc>
-          <w:tcPr>
-            <w:tcW w:type="dxa" w:w="1440"/>
-          </w:tcPr>
-          <w:p>
-            <w:r>
-              <w:t>4</w:t>
-            </w:r>
-          </w:p>
-        </w:tc>
-        <w:tc>
-          <w:tcPr>
-            <w:tcW w:type="dxa" w:w="1440"/>
-          </w:tcPr>
-          <w:p>
-            <w:r>
-              <w:t>5</w:t>
-            </w:r>
-          </w:p>
-        </w:tc>
-        <w:tc>
-          <w:tcPr>
-            <w:tcW w:type="dxa" w:w="1440"/>
-          </w:tcPr>
-          <w:p>
-            <w:r>
-              <w:t>2</w:t>
+              <w:t>3</w:t>
             </w:r>
           </w:p>
         </w:tc>

</xml_diff>